<commit_message>
data: close Gemini diagnostic stopping rule
</commit_message>
<xml_diff>
--- a/docs/research/paper_v2/manuscript/M3_PI_Guard_JISA_chinese_comparison.docx
+++ b/docs/research/paper_v2/manuscript/M3_PI_Guard_JISA_chinese_comparison.docx
@@ -55,7 +55,7 @@
           <w:rFonts w:ascii="Times New Roman" w:hAnsi="Times New Roman" w:eastAsia="SimSun"/>
           <w:lang w:val="en-US" w:eastAsia="zh-CN"/>
         </w:rPr>
-        <w:t xml:space="preserve">本文为当前英文工作稿的简体中文对照版，用于作者内部核对、团队交流和方法审阅。统计数字、样本分母、结论边界与英文稿保持一致；正式向 JISA 投稿时仍以英文稿为准。Gemini 跨厂商样本尚未完成，因此本文不作跨厂商泛化主张。</w:t>
+        <w:t xml:space="preserve">本文为当前英文工作稿的简体中文对照版，用于作者内部核对、团队交流和方法审阅。统计数字、样本分母、结论边界与英文稿保持一致；正式向 JISA 投稿时仍以英文稿为准。Gemini 跨厂商样本已按免费层停止规则以不完整诊断样本结账，因此本文不作跨厂商泛化主张。</w:t>
       </w:r>
     </w:p>
     <w:bookmarkStart w:id="20" w:name="摘要"/>
@@ -299,7 +299,7 @@
           <w:rFonts w:ascii="Times New Roman" w:hAnsi="Times New Roman" w:eastAsia="SimSun"/>
           <w:lang w:val="en-US" w:eastAsia="zh-CN"/>
         </w:rPr>
-        <w:t xml:space="preserve">因此，即使攻击率表面稳定，授权构造仍会改变安全—效用测量。本文评估的来源感知扩展相对 policy-only 未表现出稳定增益。Gemini 样本仍处于待完成状态，当前结果不支持任何跨厂商结论。</w:t>
+        <w:t xml:space="preserve">因此，即使攻击率表面稳定，授权构造仍会改变安全—效用测量。本文评估的来源感知扩展相对 policy-only 未表现出稳定增益。Gemini 免费层执行在 32/450 个终态工作项时关闭，因此当前结果不支持任何跨厂商结论。</w:t>
       </w:r>
     </w:p>
     <w:p>
@@ -1185,7 +1185,7 @@
           <w:rFonts w:ascii="Times New Roman" w:hAnsi="Times New Roman" w:eastAsia="SimSun"/>
           <w:lang w:val="en-US" w:eastAsia="zh-CN"/>
         </w:rPr>
-        <w:t xml:space="preserve">，并提高失败率与时延。M3-full 相对 policy-only 未表现出稳定的增量安全或效用优势。所有不利结果均被保留；Gemini 尚未完成，因而当前不能支持跨厂商主张。</w:t>
+        <w:t xml:space="preserve">，并提高失败率与时延。M3-full 相对 policy-only 未表现出稳定的增量安全或效用优势。所有不利结果均被保留；Gemini 在 32/450 个终态工作项时按停止规则降级为诊断样本，不能支持跨厂商主张。</w:t>
       </w:r>
     </w:p>
     <w:bookmarkEnd w:id="25"/>
@@ -5417,7 +5417,7 @@
           <w:rFonts w:ascii="Times New Roman" w:hAnsi="Times New Roman" w:eastAsia="SimSun"/>
           <w:lang w:val="en-US" w:eastAsia="zh-CN"/>
         </w:rPr>
-        <w:t xml:space="preserve">中型、Public Pro、Public Flash、授权制度和预算 50/200 研究共同支持安全—效用实证论文，但不支持领先防御、来源因果效应、自适应攻击饱和或跨厂商结论。Gemini 在三个配额日免费层规则下仍未完成；在达到停止规则前，其部分记录不进入以上推断。当前记录契约无法识别 UTR 和 DSR，本文不根据不安全效应率反推二者。</w:t>
+        <w:t xml:space="preserve">中型、Public Pro、Public Flash、授权制度和预算 50/200 研究共同支持安全—效用实证论文，但不支持领先防御、来源因果效应、自适应攻击饱和或跨厂商结论。Gemini 在三个配额日免费层停止规则下以 32/450 个终态工作项结账，其中 5 项含官方响应，83 项已观察但仍非终态，335 项未触及。不完整样本仅用于运行可用性核算，不进入以上推断。当前记录契约无法识别 UTR 和 DSR，本文不根据不安全效应率反推二者。</w:t>
       </w:r>
     </w:p>
     <w:bookmarkEnd w:id="58"/>
@@ -6090,7 +6090,7 @@
           <w:rFonts w:ascii="Times New Roman" w:hAnsi="Times New Roman" w:eastAsia="SimSun"/>
           <w:lang w:val="en-US" w:eastAsia="zh-CN"/>
         </w:rPr>
-        <w:t xml:space="preserve">在本次分析截止时，Gemini 样本仍未完成，其部分记录不进入推断。因此，当前外部有效性仅覆盖 DeepSeek V4 Pro 与 V4 Flash，本文不作跨厂商结论。</w:t>
+        <w:t xml:space="preserve">停止规则关闭时，Gemini 仅有 32/450 个终态工作项，其中 5 项含官方模型响应；另有 83 项已观察但仍非终态，335 项未触及。这些记录仅用于运行核算，不进入科学推断。因此，当前外部有效性仅覆盖 DeepSeek V4 Pro 与 V4 Flash，本文不作跨厂商结论。</w:t>
       </w:r>
     </w:p>
     <w:bookmarkEnd w:id="65"/>
@@ -6272,7 +6272,7 @@
           <w:rFonts w:ascii="Times New Roman" w:hAnsi="Times New Roman" w:eastAsia="SimSun"/>
           <w:lang w:val="en-US" w:eastAsia="zh-CN"/>
         </w:rPr>
-        <w:t xml:space="preserve">DeepSeek 授权制度结果为这些建议提供了观察依据：精确与压力策略在不安全效应接近零时，仍显著改变完成、阻断、失败和时延。预设 Gemini 停止规则将决定是否能获得完整跨厂商比较；不完整子集只能作诊断，不能改变或扩展 DeepSeek 发现。</w:t>
+        <w:t xml:space="preserve">DeepSeek 授权制度结果为这些建议提供了观察依据：精确与压力策略在不安全效应接近零时，仍显著改变完成、阻断、失败和时延。预设 Gemini 停止规则最终关闭于不完整诊断子集，该子集不能改变或扩展 DeepSeek 发现。</w:t>
       </w:r>
     </w:p>
     <w:bookmarkEnd w:id="67"/>
@@ -6394,7 +6394,7 @@
           <w:rFonts w:ascii="Times New Roman" w:hAnsi="Times New Roman" w:eastAsia="SimSun"/>
           <w:lang w:val="en-US" w:eastAsia="zh-CN"/>
         </w:rPr>
-        <w:t xml:space="preserve">综合而言，工具型智能体安全评估应满足三项要求：将仅供评估的字段排除在在线 Guard 状态之外；在相同任务上用 policy-only 消融对照复杂机制；在不安全效应之外同时报告效用、ASK/DENY 负担、失败、时延和攻击预算。结论仅适用于已测试策略、基准、运行时实现、DeepSeek 模型和预算范围。预设 Gemini 样本要么检验跨厂商方向，要么按免费层停止规则透明降级；它不能抹去或扩大已经完成的 DeepSeek 发现。</w:t>
+        <w:t xml:space="preserve">综合而言，工具型智能体安全评估应满足三项要求：将仅供评估的字段排除在在线 Guard 状态之外；在相同任务上用 policy-only 消融对照复杂机制；在不安全效应之外同时报告效用、ASK/DENY 负担、失败、时延和攻击预算。结论仅适用于已测试策略、基准、运行时实现、DeepSeek 模型和预算范围。预设 Gemini 样本已按免费层停止规则透明降级为不完整诊断样本；它不能抹去或扩大已经完成的 DeepSeek 发现。</w:t>
       </w:r>
     </w:p>
     <w:bookmarkEnd w:id="69"/>
@@ -6765,7 +6765,7 @@
           <w:rFonts w:ascii="Times New Roman" w:hAnsi="Times New Roman" w:eastAsia="SimSun"/>
           <w:lang w:val="en-US" w:eastAsia="zh-CN"/>
         </w:rPr>
-        <w:t xml:space="preserve">精简实证研究的服务商、基准、条件、授权制度及冻结工作项数量。Gemini 数量仍为计划值，其不完整记录不进入推断。</w:t>
+        <w:t xml:space="preserve">精简实证研究的服务商、基准、条件、授权制度及冻结工作项数量。Gemini 列仍给出冻结计划分母；其不完整终态诊断样本不进入推断。</w:t>
       </w:r>
     </w:p>
     <w:tbl>

</xml_diff>

<commit_message>
paper: pass stage 2.5 integrity review
</commit_message>
<xml_diff>
--- a/docs/research/paper_v2/manuscript/M3_PI_Guard_JISA_chinese_comparison.docx
+++ b/docs/research/paper_v2/manuscript/M3_PI_Guard_JISA_chinese_comparison.docx
@@ -436,7 +436,7 @@
           <w:rFonts w:ascii="Times New Roman" w:hAnsi="Times New Roman" w:eastAsia="SimSun"/>
           <w:lang w:val="en-US" w:eastAsia="zh-CN"/>
         </w:rPr>
-        <w:t xml:space="preserve">(Lin et al. 2026; Tsai and Bagdasarian 2025; Shi et al. 2025; An et al. 2025; Debenedetti et al. 2025)</w:t>
+        <w:t xml:space="preserve">(Lin et al. 2026; Tsai and Bagdasaryan 2025; Shi et al. 2025; An et al. 2025; Debenedetti et al. 2025)</w:t>
       </w:r>
       <w:r>
         <w:rPr>
@@ -19691,7 +19691,7 @@
           <w:rFonts w:ascii="Times New Roman" w:hAnsi="Times New Roman" w:eastAsia="SimSun"/>
           <w:lang w:val="en-US" w:eastAsia="zh-CN"/>
         </w:rPr>
-        <w:t xml:space="preserve">Tsai, Lillian, and Eugene Bagdasarian. 2025.</w:t>
+        <w:t xml:space="preserve">Tsai, Lillian, and Eugene Bagdasaryan. 2025.</w:t>
       </w:r>
       <w:r>
         <w:rPr>

</xml_diff>

<commit_message>
paper: pass stage 4.5 integrity gate
</commit_message>
<xml_diff>
--- a/docs/research/paper_v2/manuscript/M3_PI_Guard_JISA_chinese_comparison.docx
+++ b/docs/research/paper_v2/manuscript/M3_PI_Guard_JISA_chinese_comparison.docx
@@ -1676,7 +1676,7 @@
           <w:rFonts w:ascii="Times New Roman" w:hAnsi="Times New Roman" w:eastAsia="SimSun"/>
           <w:lang w:val="en-US" w:eastAsia="zh-CN"/>
         </w:rPr>
-        <w:t xml:space="preserve">因此，当前可辩护的贡献主要是方法与实证：检验授权信息本身是否改变所测安全与效用；通过运行时投影排除评估字段；在配对条件下比较 policy-only 与完整来源/时序/确认机制；并在统一证据契约下量化</w:t>
+        <w:t xml:space="preserve">因此，当前可辩护的贡献主要是方法与实证：检验授权信息本身是否改变所测安全与效用；通过运行时投影排除评估字段；在披露提示与运行时差异成套变化的前提下，对策略配置包和完整配置包进行配对比较；并在统一证据契约下量化</w:t>
       </w:r>
       <w:r>
         <w:rPr>
@@ -21701,7 +21701,35 @@
           <w:rFonts w:ascii="Times New Roman" w:hAnsi="Times New Roman" w:eastAsia="SimSun"/>
           <w:lang w:val="en-US" w:eastAsia="zh-CN"/>
         </w:rPr>
-        <w:t xml:space="preserve">“The Attacker Moves Second: Stronger Adaptive Attacks Bypass Defenses Against Llm Jailbreaks and Prompt Injections.”</w:t>
+        <w:t xml:space="preserve">“The Attacker Moves Second: Stronger Adaptive Attacks Bypass Defenses Against</w:t>
+      </w:r>
+      <w:r>
+        <w:rPr>
+          <w:rFonts w:ascii="Times New Roman" w:hAnsi="Times New Roman" w:eastAsia="SimSun"/>
+          <w:lang w:val="en-US" w:eastAsia="zh-CN"/>
+        </w:rPr>
+        <w:t xml:space="preserve"> </w:t>
+      </w:r>
+      <w:r>
+        <w:rPr>
+          <w:rFonts w:ascii="Times New Roman" w:hAnsi="Times New Roman" w:eastAsia="SimSun"/>
+          <w:lang w:val="en-US" w:eastAsia="zh-CN"/>
+        </w:rPr>
+        <w:t xml:space="preserve">LLM</w:t>
+      </w:r>
+      <w:r>
+        <w:rPr>
+          <w:rFonts w:ascii="Times New Roman" w:hAnsi="Times New Roman" w:eastAsia="SimSun"/>
+          <w:lang w:val="en-US" w:eastAsia="zh-CN"/>
+        </w:rPr>
+        <w:t xml:space="preserve"> </w:t>
+      </w:r>
+      <w:r>
+        <w:rPr>
+          <w:rFonts w:ascii="Times New Roman" w:hAnsi="Times New Roman" w:eastAsia="SimSun"/>
+          <w:lang w:val="en-US" w:eastAsia="zh-CN"/>
+        </w:rPr>
+        <w:t xml:space="preserve">Jailbreaks and Prompt Injections.”</w:t>
       </w:r>
       <w:r>
         <w:rPr>
@@ -22251,6 +22279,20 @@
       </w:r>
       <w:r>
         <w:rPr>
+          <w:rFonts w:ascii="Times New Roman" w:hAnsi="Times New Roman" w:eastAsia="SimSun"/>
+          <w:lang w:val="en-US" w:eastAsia="zh-CN"/>
+        </w:rPr>
+        <w:t xml:space="preserve">In</w:t>
+      </w:r>
+      <w:r>
+        <w:rPr>
+          <w:rFonts w:ascii="Times New Roman" w:hAnsi="Times New Roman" w:eastAsia="SimSun"/>
+          <w:lang w:val="en-US" w:eastAsia="zh-CN"/>
+        </w:rPr>
+        <w:t xml:space="preserve"> </w:t>
+      </w:r>
+      <w:r>
+        <w:rPr>
           <w:iCs/>
           <w:rFonts w:ascii="Times New Roman" w:hAnsi="Times New Roman" w:eastAsia="SimSun"/>
           <w:i/>
@@ -22263,14 +22305,7 @@
           <w:rFonts w:ascii="Times New Roman" w:hAnsi="Times New Roman" w:eastAsia="SimSun"/>
           <w:lang w:val="en-US" w:eastAsia="zh-CN"/>
         </w:rPr>
-        <w:t xml:space="preserve"> </w:t>
-      </w:r>
-      <w:r>
-        <w:rPr>
-          <w:rFonts w:ascii="Times New Roman" w:hAnsi="Times New Roman" w:eastAsia="SimSun"/>
-          <w:lang w:val="en-US" w:eastAsia="zh-CN"/>
-        </w:rPr>
-        <w:t xml:space="preserve">2025: 35331–66.</w:t>
+        <w:t xml:space="preserve">, edited by Y. Yue, A. Garg, N. Peng, F. Sha, and R. Yu, 2025:35331–66.</w:t>
       </w:r>
       <w:r>
         <w:rPr>
@@ -22284,7 +22319,7 @@
           <w:rPr>
             <w:rStyle w:val="Hyperlink"/>
           </w:rPr>
-          <w:t xml:space="preserve">https://proceedings.iclr.cc/paper_files/paper/2025/hash/5750f91d8fb9d5c02bd8ad2c3b44456b-Abstract-Conference.html</w:t>
+          <w:t xml:space="preserve">https://proceedings.iclr.cc/paper_files/paper/2025/file/5750f91d8fb9d5c02bd8ad2c3b44456b-Paper-Conference.pdf</w:t>
         </w:r>
       </w:hyperlink>
       <w:r>

</xml_diff>